<commit_message>
Add both Loom videos to the final submission
</commit_message>
<xml_diff>
--- a/docs/submission/Darsh Jaiswal – Systems & AI Automation Intern (Round 2).docx
+++ b/docs/submission/Darsh Jaiswal – Systems & AI Automation Intern (Round 2).docx
@@ -30,7 +30,7 @@
         <w:rPr/>
       </w:pPr>
       <w:r>
-        <w:t>Filled copy of the supplied assignment. Loom recording and share link will be added after recording.</w:t>
+        <w:t>Filled copy of the supplied assignment. Both Loom video links are included in the Submission table.</w:t>
       </w:r>
     </w:p>
     <w:p>
@@ -10673,7 +10673,7 @@
         <w:pStyle w:val="Answer"/>
       </w:pPr>
       <w:r>
-        <w:t>Submission status: written answers and evidence filled; Loom recording/link remains. No candidate Drive link is used here. The original resource video above belongs to the assignment and is not my Loom submission. Attach this PDF when replying to the original email thread after adding the Loom link.</w:t>
+        <w:t>Submission status: written answers, evidence and both candidate-supplied Loom video links are included. No candidate Drive link is used here. The original resource video above belongs to the assignment and is separate from my two Loom videos in the table below. Attach this PDF when replying to the original email thread.</w:t>
       </w:r>
     </w:p>
     <w:p>
@@ -10899,24 +10899,12 @@
             </w:tcMar>
           </w:tcPr>
           <w:p>
-            <w:pPr>
-              <w:rPr/>
-            </w:pPr>
-            <w:r>
-              <w:rPr>
-                <w:rFonts w:ascii="Arial" w:cs="Arial" w:eastAsia="Arial" w:hAnsi="Arial"/>
-                <w:b w:val="1"/>
-                <w:bCs w:val="1"/>
-                <w:sz w:val="22"/>
-                <w:szCs w:val="22"/>
-                <w:rtl w:val="0"/>
-              </w:rPr>
-              <w:t xml:space="preserve">Loom video</w:t>
-            </w:r>
-            <w:r>
-              <w:rPr>
-                <w:rtl w:val="0"/>
-              </w:rPr>
+            <w:r>
+              <w:rPr>
+                <w:rFonts w:ascii="Arial" w:hAnsi="Arial"/>
+                <w:sz w:val="20"/>
+              </w:rPr>
+              <w:t>Loom videos</w:t>
             </w:r>
           </w:p>
         </w:tc>
@@ -10938,15 +10926,53 @@
           </w:tcPr>
           <w:p>
             <w:pPr>
-              <w:spacing w:after="80"/>
+              <w:spacing w:after="120"/>
             </w:pPr>
             <w:r>
               <w:rPr>
                 <w:rFonts w:ascii="Arial" w:hAnsi="Arial"/>
                 <w:sz w:val="20"/>
               </w:rPr>
-              <w:t>To be added after the candidate records the Loom video.</w:t>
-            </w:r>
+            </w:r>
+            <w:r>
+              <w:rPr>
+                <w:rFonts w:ascii="Arial" w:hAnsi="Arial"/>
+                <w:sz w:val="20"/>
+              </w:rPr>
+              <w:t xml:space="preserve">Video 1: </w:t>
+            </w:r>
+            <w:hyperlink r:id="rId146">
+              <w:r>
+                <w:rPr>
+                  <w:color w:val="0563C1"/>
+                  <w:u w:val="single"/>
+                  <w:sz w:val="20"/>
+                </w:rPr>
+                <w:t>https://www.loom.com/share/54cf4ab34cab482083928aebe413aa01</w:t>
+              </w:r>
+            </w:hyperlink>
+          </w:p>
+          <w:p>
+            <w:pPr>
+              <w:spacing w:after="120"/>
+            </w:pPr>
+            <w:r>
+              <w:rPr>
+                <w:rFonts w:ascii="Arial" w:hAnsi="Arial"/>
+                <w:sz w:val="20"/>
+              </w:rPr>
+              <w:t xml:space="preserve">Video 2: </w:t>
+            </w:r>
+            <w:hyperlink r:id="rId147">
+              <w:r>
+                <w:rPr>
+                  <w:color w:val="0563C1"/>
+                  <w:u w:val="single"/>
+                  <w:sz w:val="20"/>
+                </w:rPr>
+                <w:t>https://www.loom.com/share/627c6e12bc254cd0b343fff8f97bc6d6</w:t>
+              </w:r>
+            </w:hyperlink>
           </w:p>
         </w:tc>
       </w:tr>
@@ -11168,7 +11194,7 @@
         <w:color w:val="666666"/>
         <w:sz w:val="16"/>
       </w:rPr>
-      <w:t xml:space="preserve">Darsh Jaiswal | Myntmore Round 2 | Loom link to be added after recording | </w:t>
+      <w:t xml:space="preserve">Darsh Jaiswal | Myntmore Round 2 | </w:t>
     </w:r>
     <w:fldSimple w:instr="PAGE"/>
   </w:p>

</xml_diff>